<commit_message>
Correct cryptocurrency calendar explanation
</commit_message>
<xml_diff>
--- a/report/report.docx
+++ b/report/report.docx
@@ -86,7 +86,15 @@
           <w:sz w:val="22"/>
           <w:lang w:eastAsia="zh-CN"/>
         </w:rPr>
-        <w:t>Word Count:4918</w:t>
+        <w:t>Word Count:49</w:t>
+      </w:r>
+      <w:r>
+        <w:rPr>
+          <w:rFonts w:hint="eastAsia"/>
+          <w:sz w:val="22"/>
+          <w:lang w:eastAsia="zh-CN"/>
+        </w:rPr>
+        <w:t>35</w:t>
       </w:r>
     </w:p>
     <w:p>
@@ -213,7 +221,7 @@
         <w:ind w:firstLine="720"/>
       </w:pPr>
       <w:r>
-        <w:t>Equity and cryptocurrency returns retain their native calendars during calculation. Equity observations follow trading days, while cryptocurrency prices are available seven days a week. Once both return panels have been constructed, cryptocurrency returns are left-joined to the equity calendar for combined strategies. The combined fund therefore makes decisions and records holding-period returns on the equity schedule. Weekend cryptocurrency movements enter through the returns already calculated on the cryptocurrency calendar; the code does not create returns from aligned price levels. The ten cryptocurrency observations dated 1 January 2024 are excluded so that the dataset ends on 31 December 2023 as intended.</w:t>
+        <w:t>Equity and cryptocurrency returns retain their native calendars during calculation. Equity observations follow trading days, while cryptocurrency prices are available seven days a week. Once both return panels have been constructed, cryptocurrency returns are left-joined to the equity calendar for combined strategies. The combined fund therefore makes decisions and records holding-period returns on the equity schedule. After returns are calculated on their native calendars, cryptocurrency returns are left-joined to the equity trading calendar. Daily cryptocurrency returns that occur only on non-equity trading dates are therefore excluded. The retained returns are not recomputed from aligned price levels. The ten cryptocurrency observations dated 1 January 2024 are excluded so that the dataset ends on 31 December 2023 as intended.</w:t>
       </w:r>
     </w:p>
     <w:p>
@@ -789,7 +797,6 @@
       <w:pPr>
         <w:ind w:firstLine="720"/>
         <w:rPr>
-          <w:rFonts w:hint="eastAsia"/>
           <w:lang w:eastAsia="zh-CN"/>
         </w:rPr>
       </w:pPr>

</xml_diff>